<commit_message>
Expand pay portal workflows
</commit_message>
<xml_diff>
--- a/Docx Files Template/Data Request LetterHead.docx
+++ b/Docx Files Template/Data Request LetterHead.docx
@@ -210,30 +210,45 @@
       </w:r>
     </w:p>
     <w:p/>
-    <w:sdt>
-      <w:sdtPr>
-        <w:id w:val="-1468046472"/>
-        <w:placeholder>
-          <w:docPart w:val="DefaultPlaceholder_-1854013440"/>
-        </w:placeholder>
-        <w:text/>
-      </w:sdtPr>
-      <w:sdtContent>
-        <w:p>
-          <w:r>
-            <w:t xml:space="preserve">{{ </w:t>
-          </w:r>
-          <w:proofErr w:type="spellStart"/>
-          <w:r>
-            <w:t>data_requested</w:t>
-          </w:r>
-          <w:proofErr w:type="spellEnd"/>
-          <w:r>
-            <w:t xml:space="preserve"> }}</w:t>
-          </w:r>
-        </w:p>
-      </w:sdtContent>
-    </w:sdt>
+    <w:p>
+      <w:pPr>
+        <w:spacing w:after="0" w:line="240" w:lineRule="auto"/>
+      </w:pPr>
+      <w:r>
+        <w:rPr>
+          <w:rFonts w:ascii="Arial" w:hAnsi="Arial"/>
+          <w:vanish/>
+          <w:color w:val="FFFFFF"/>
+          <w:sz w:val="2"/>
+        </w:rPr>
+        <w:t>{%p for row in data_requested_rows %}</w:t>
+      </w:r>
+    </w:p>
+    <w:p>
+      <w:pPr>
+        <w:spacing w:after="0" w:line="240" w:lineRule="auto"/>
+      </w:pPr>
+      <w:r>
+        <w:rPr>
+          <w:rFonts w:ascii="Arial" w:hAnsi="Arial"/>
+        </w:rPr>
+        <w:t>{{ row.text }}</w:t>
+      </w:r>
+    </w:p>
+    <w:p>
+      <w:pPr>
+        <w:spacing w:after="0" w:line="240" w:lineRule="auto"/>
+      </w:pPr>
+      <w:r>
+        <w:rPr>
+          <w:rFonts w:ascii="Arial" w:hAnsi="Arial"/>
+          <w:vanish/>
+          <w:color w:val="FFFFFF"/>
+          <w:sz w:val="2"/>
+        </w:rPr>
+        <w:t>{%p endfor %}</w:t>
+      </w:r>
+    </w:p>
     <w:p>
       <w:r>
         <w:t xml:space="preserve">Please provide this information in </w:t>

</xml_diff>

<commit_message>
Bring grievance automation work onto main integration branch
Applies the codex/grievance-work-20260506 feature set onto origin/main as a clean main-target commit while excluding prohibited dot-env files from main history.

Adds pay portal schema, routes, services, officer workflows, settlement/tracker repair tooling, statement auto-sign safeguards, local-safe runtime providers, and the related tests and documentation.

Adds dues-form PDF intake with SharePoint sync, ignored-file auditing, OCR support, exports, UI routes, systemd timer files, and compatibility scanner entrypoints.

Adds local-safe development support with disk-backed mail, SharePoint, and DocuSeal providers, APP_MODE-aware provider construction, APP_CONFIG_PATH support, config examples, a non-dotfile local env template, and the local smoke test script.

Keeps real config, certs, .env files, local databases, and runtime data out of the main integration commit.
</commit_message>
<xml_diff>
--- a/Docx Files Template/Data Request LetterHead.docx
+++ b/Docx Files Template/Data Request LetterHead.docx
@@ -210,30 +210,45 @@
       </w:r>
     </w:p>
     <w:p/>
-    <w:sdt>
-      <w:sdtPr>
-        <w:id w:val="-1468046472"/>
-        <w:placeholder>
-          <w:docPart w:val="DefaultPlaceholder_-1854013440"/>
-        </w:placeholder>
-        <w:text/>
-      </w:sdtPr>
-      <w:sdtContent>
-        <w:p>
-          <w:r>
-            <w:t xml:space="preserve">{{ </w:t>
-          </w:r>
-          <w:proofErr w:type="spellStart"/>
-          <w:r>
-            <w:t>data_requested</w:t>
-          </w:r>
-          <w:proofErr w:type="spellEnd"/>
-          <w:r>
-            <w:t xml:space="preserve"> }}</w:t>
-          </w:r>
-        </w:p>
-      </w:sdtContent>
-    </w:sdt>
+    <w:p>
+      <w:pPr>
+        <w:spacing w:after="0" w:line="240" w:lineRule="auto"/>
+      </w:pPr>
+      <w:r>
+        <w:rPr>
+          <w:rFonts w:ascii="Arial" w:hAnsi="Arial"/>
+          <w:vanish/>
+          <w:color w:val="FFFFFF"/>
+          <w:sz w:val="2"/>
+        </w:rPr>
+        <w:t>{%p for row in data_requested_rows %}</w:t>
+      </w:r>
+    </w:p>
+    <w:p>
+      <w:pPr>
+        <w:spacing w:after="0" w:line="240" w:lineRule="auto"/>
+      </w:pPr>
+      <w:r>
+        <w:rPr>
+          <w:rFonts w:ascii="Arial" w:hAnsi="Arial"/>
+        </w:rPr>
+        <w:t>{{ row.text }}</w:t>
+      </w:r>
+    </w:p>
+    <w:p>
+      <w:pPr>
+        <w:spacing w:after="0" w:line="240" w:lineRule="auto"/>
+      </w:pPr>
+      <w:r>
+        <w:rPr>
+          <w:rFonts w:ascii="Arial" w:hAnsi="Arial"/>
+          <w:vanish/>
+          <w:color w:val="FFFFFF"/>
+          <w:sz w:val="2"/>
+        </w:rPr>
+        <w:t>{%p endfor %}</w:t>
+      </w:r>
+    </w:p>
     <w:p>
       <w:r>
         <w:t xml:space="preserve">Please provide this information in </w:t>

</xml_diff>